<commit_message>
612 - before block VLANs
</commit_message>
<xml_diff>
--- a/2026-T1/T1B2-ICTNWK612-Plan-manage-troubleshooting-advance/2-tasks/Troubleshooting-and-Monitoring-Plan.docx
+++ b/2026-T1/T1B2-ICTNWK612-Plan-manage-troubleshooting-advance/2-tasks/Troubleshooting-and-Monitoring-Plan.docx
@@ -16499,12 +16499,12 @@
       <w:pPr>
         <w:pStyle w:val="Heading2"/>
         <w:rPr>
-          <w:rFonts w:eastAsia="Arial"/>
-        </w:rPr>
-      </w:pPr>
-      <w:r>
-        <w:rPr>
-          <w:rFonts w:eastAsia="Arial"/>
+          <w:rFonts w:ascii="Arial" w:eastAsia="Arial" w:hAnsi="Arial" w:cs="Arial"/>
+        </w:rPr>
+      </w:pPr>
+      <w:r>
+        <w:rPr>
+          <w:rFonts w:ascii="Arial" w:eastAsia="Arial" w:hAnsi="Arial" w:cs="Arial"/>
         </w:rPr>
         <w:t>Target Dual-Stack Architecture</w:t>
       </w:r>
@@ -17242,8 +17242,14 @@
     <w:p>
       <w:pPr>
         <w:pStyle w:val="Heading2"/>
-      </w:pPr>
-      <w:r>
+        <w:rPr>
+          <w:rFonts w:ascii="Arial" w:hAnsi="Arial" w:cs="Arial"/>
+        </w:rPr>
+      </w:pPr>
+      <w:r>
+        <w:rPr>
+          <w:rFonts w:ascii="Arial" w:hAnsi="Arial" w:cs="Arial"/>
+        </w:rPr>
         <w:t>IPv6 Addressing Plan</w:t>
       </w:r>
     </w:p>
@@ -18025,12 +18031,12 @@
       <w:pPr>
         <w:pStyle w:val="Heading3"/>
         <w:rPr>
-          <w:rFonts w:eastAsia="Arial"/>
-        </w:rPr>
-      </w:pPr>
-      <w:r>
-        <w:rPr>
-          <w:rFonts w:eastAsia="Arial"/>
+          <w:rFonts w:ascii="Arial" w:eastAsia="Arial" w:hAnsi="Arial" w:cs="Arial"/>
+        </w:rPr>
+      </w:pPr>
+      <w:r>
+        <w:rPr>
+          <w:rFonts w:ascii="Arial" w:eastAsia="Arial" w:hAnsi="Arial" w:cs="Arial"/>
         </w:rPr>
         <w:lastRenderedPageBreak/>
         <w:t>VLAN – IPv6 Prefix Mapping (Dual-Stack)</w:t>
@@ -18772,8 +18778,14 @@
     <w:p>
       <w:pPr>
         <w:pStyle w:val="Heading2"/>
-      </w:pPr>
-      <w:r>
+        <w:rPr>
+          <w:rFonts w:ascii="Arial" w:hAnsi="Arial" w:cs="Arial"/>
+        </w:rPr>
+      </w:pPr>
+      <w:r>
+        <w:rPr>
+          <w:rFonts w:ascii="Arial" w:hAnsi="Arial" w:cs="Arial"/>
+        </w:rPr>
         <w:t>Interoperability Mechanisms in Dual-Stack</w:t>
       </w:r>
     </w:p>
@@ -18823,12 +18835,12 @@
       <w:pPr>
         <w:pStyle w:val="Heading2"/>
         <w:rPr>
-          <w:rFonts w:eastAsia="Arial"/>
-        </w:rPr>
-      </w:pPr>
-      <w:r>
-        <w:rPr>
-          <w:rFonts w:eastAsia="Arial"/>
+          <w:rFonts w:ascii="Arial" w:eastAsia="Arial" w:hAnsi="Arial" w:cs="Arial"/>
+        </w:rPr>
+      </w:pPr>
+      <w:r>
+        <w:rPr>
+          <w:rFonts w:ascii="Arial" w:eastAsia="Arial" w:hAnsi="Arial" w:cs="Arial"/>
         </w:rPr>
         <w:t>Summary of IPv4/IPv6 Interoperability Mechanisms</w:t>
       </w:r>
@@ -18836,7 +18848,7 @@
     <w:p>
       <w:pPr>
         <w:rPr>
-          <w:rFonts w:eastAsia="Arial"/>
+          <w:rFonts w:ascii="Arial" w:eastAsia="Arial" w:hAnsi="Arial" w:cs="Arial"/>
         </w:rPr>
       </w:pPr>
     </w:p>
@@ -18861,7 +18873,7 @@
     <w:p>
       <w:pPr>
         <w:rPr>
-          <w:rFonts w:eastAsia="Arial"/>
+          <w:rFonts w:ascii="Arial" w:eastAsia="Arial" w:hAnsi="Arial" w:cs="Arial"/>
         </w:rPr>
       </w:pPr>
     </w:p>
@@ -19405,7 +19417,7 @@
       </w:pPr>
       <w:r>
         <w:rPr>
-          <w:rFonts w:eastAsia="Arial"/>
+          <w:rFonts w:ascii="Arial" w:eastAsia="Arial" w:hAnsi="Arial" w:cs="Arial"/>
         </w:rPr>
         <w:t>Segment Isolation Methods in Dual-Stack</w:t>
       </w:r>
@@ -20065,8 +20077,14 @@
     <w:p>
       <w:pPr>
         <w:pStyle w:val="Heading2"/>
-      </w:pPr>
-      <w:r>
+        <w:rPr>
+          <w:rFonts w:ascii="Arial" w:hAnsi="Arial" w:cs="Arial"/>
+        </w:rPr>
+      </w:pPr>
+      <w:r>
+        <w:rPr>
+          <w:rFonts w:ascii="Arial" w:hAnsi="Arial" w:cs="Arial"/>
+        </w:rPr>
         <w:t>Troubleshooting IPv4/IPv6 Interoperability</w:t>
       </w:r>
     </w:p>
@@ -20531,12 +20549,12 @@
       <w:pPr>
         <w:pStyle w:val="Heading2"/>
         <w:rPr>
-          <w:rFonts w:eastAsia="Arial"/>
-        </w:rPr>
-      </w:pPr>
-      <w:r>
-        <w:rPr>
-          <w:rFonts w:eastAsia="Arial"/>
+          <w:rFonts w:ascii="Arial" w:eastAsia="Arial" w:hAnsi="Arial" w:cs="Arial"/>
+        </w:rPr>
+      </w:pPr>
+      <w:r>
+        <w:rPr>
+          <w:rFonts w:ascii="Arial" w:eastAsia="Arial" w:hAnsi="Arial" w:cs="Arial"/>
         </w:rPr>
         <w:t>Failure Scenario Matrix</w:t>
       </w:r>
@@ -21718,18 +21736,30 @@
     <w:p>
       <w:pPr>
         <w:pStyle w:val="Heading2"/>
+        <w:rPr>
+          <w:rFonts w:ascii="Arial" w:hAnsi="Arial" w:cs="Arial"/>
+        </w:rPr>
       </w:pPr>
     </w:p>
     <w:p>
       <w:pPr>
         <w:pStyle w:val="Heading2"/>
+        <w:rPr>
+          <w:rFonts w:ascii="Arial" w:hAnsi="Arial" w:cs="Arial"/>
+        </w:rPr>
       </w:pPr>
     </w:p>
     <w:p>
       <w:pPr>
         <w:pStyle w:val="Heading2"/>
-      </w:pPr>
-      <w:r>
+        <w:rPr>
+          <w:rFonts w:ascii="Arial" w:hAnsi="Arial" w:cs="Arial"/>
+        </w:rPr>
+      </w:pPr>
+      <w:r>
+        <w:rPr>
+          <w:rFonts w:ascii="Arial" w:hAnsi="Arial" w:cs="Arial"/>
+        </w:rPr>
         <w:t>Specific Troubleshooting Sequences</w:t>
       </w:r>
     </w:p>
@@ -21738,7 +21768,7 @@
         <w:pStyle w:val="Heading3"/>
         <w:jc w:val="center"/>
         <w:rPr>
-          <w:rFonts w:eastAsia="Arial"/>
+          <w:rFonts w:ascii="Arial" w:eastAsia="Arial" w:hAnsi="Arial" w:cs="Arial"/>
         </w:rPr>
       </w:pPr>
     </w:p>
@@ -21747,12 +21777,12 @@
         <w:pStyle w:val="Heading3"/>
         <w:jc w:val="center"/>
         <w:rPr>
-          <w:rFonts w:eastAsia="Arial"/>
-        </w:rPr>
-      </w:pPr>
-      <w:r>
-        <w:rPr>
-          <w:rFonts w:eastAsia="Arial"/>
+          <w:rFonts w:ascii="Arial" w:eastAsia="Arial" w:hAnsi="Arial" w:cs="Arial"/>
+        </w:rPr>
+      </w:pPr>
+      <w:r>
+        <w:rPr>
+          <w:rFonts w:ascii="Arial" w:eastAsia="Arial" w:hAnsi="Arial" w:cs="Arial"/>
         </w:rPr>
         <w:t>Verification of SVI and IPv6 Routing on MS1 / MS2</w:t>
       </w:r>
@@ -21955,12 +21985,12 @@
         <w:pStyle w:val="Heading3"/>
         <w:jc w:val="center"/>
         <w:rPr>
-          <w:rFonts w:eastAsia="Arial"/>
-        </w:rPr>
-      </w:pPr>
-      <w:r>
-        <w:rPr>
-          <w:rFonts w:eastAsia="Arial"/>
+          <w:rFonts w:ascii="Arial" w:eastAsia="Arial" w:hAnsi="Arial" w:cs="Arial"/>
+        </w:rPr>
+      </w:pPr>
+      <w:r>
+        <w:rPr>
+          <w:rFonts w:ascii="Arial" w:eastAsia="Arial" w:hAnsi="Arial" w:cs="Arial"/>
         </w:rPr>
         <w:lastRenderedPageBreak/>
         <w:t>Verification of IPv6 Policy on Firewall2 (ASA)</w:t>
@@ -22116,8 +22146,14 @@
       <w:pPr>
         <w:pStyle w:val="Heading3"/>
         <w:jc w:val="center"/>
-      </w:pPr>
-      <w:r>
+        <w:rPr>
+          <w:rFonts w:ascii="Arial" w:hAnsi="Arial" w:cs="Arial"/>
+        </w:rPr>
+      </w:pPr>
+      <w:r>
+        <w:rPr>
+          <w:rFonts w:ascii="Arial" w:hAnsi="Arial" w:cs="Arial"/>
+        </w:rPr>
         <w:t>Verification of RA Guard and ND Inspection</w:t>
       </w:r>
     </w:p>
@@ -22401,12 +22437,12 @@
         <w:pStyle w:val="Heading3"/>
         <w:jc w:val="center"/>
         <w:rPr>
-          <w:rFonts w:eastAsia="Arial"/>
-        </w:rPr>
-      </w:pPr>
-      <w:r>
-        <w:rPr>
-          <w:rFonts w:eastAsia="Arial"/>
+          <w:rFonts w:ascii="Arial" w:eastAsia="Arial" w:hAnsi="Arial" w:cs="Arial"/>
+        </w:rPr>
+      </w:pPr>
+      <w:r>
+        <w:rPr>
+          <w:rFonts w:ascii="Arial" w:eastAsia="Arial" w:hAnsi="Arial" w:cs="Arial"/>
         </w:rPr>
         <w:t>Diagnosing MTU Issues on the IPv6 Path</w:t>
       </w:r>
@@ -22627,12 +22663,12 @@
       <w:pPr>
         <w:pStyle w:val="Heading2"/>
         <w:rPr>
-          <w:rFonts w:eastAsia="Arial"/>
-        </w:rPr>
-      </w:pPr>
-      <w:r>
-        <w:rPr>
-          <w:rFonts w:eastAsia="Arial"/>
+          <w:rFonts w:ascii="Arial" w:eastAsia="Arial" w:hAnsi="Arial" w:cs="Arial"/>
+        </w:rPr>
+      </w:pPr>
+      <w:r>
+        <w:rPr>
+          <w:rFonts w:ascii="Arial" w:eastAsia="Arial" w:hAnsi="Arial" w:cs="Arial"/>
         </w:rPr>
         <w:lastRenderedPageBreak/>
         <w:t>Monitoring IPv4/IPv6 Interoperability</w:t>
@@ -22642,7 +22678,7 @@
       <w:pPr>
         <w:pStyle w:val="Heading3"/>
         <w:rPr>
-          <w:rFonts w:eastAsia="Arial"/>
+          <w:rFonts w:ascii="Arial" w:eastAsia="Arial" w:hAnsi="Arial" w:cs="Arial"/>
         </w:rPr>
       </w:pPr>
     </w:p>
@@ -22651,12 +22687,12 @@
         <w:pStyle w:val="Heading3"/>
         <w:jc w:val="center"/>
         <w:rPr>
-          <w:rFonts w:eastAsia="Arial"/>
-        </w:rPr>
-      </w:pPr>
-      <w:r>
-        <w:rPr>
-          <w:rFonts w:eastAsia="Arial"/>
+          <w:rFonts w:ascii="Arial" w:eastAsia="Arial" w:hAnsi="Arial" w:cs="Arial"/>
+        </w:rPr>
+      </w:pPr>
+      <w:r>
+        <w:rPr>
+          <w:rFonts w:ascii="Arial" w:eastAsia="Arial" w:hAnsi="Arial" w:cs="Arial"/>
         </w:rPr>
         <w:t>CLI Monitoring Framework (Dual-Stack Extension)</w:t>
       </w:r>
@@ -23841,12 +23877,12 @@
         <w:pStyle w:val="Heading3"/>
         <w:jc w:val="center"/>
         <w:rPr>
-          <w:rFonts w:eastAsia="Arial"/>
-        </w:rPr>
-      </w:pPr>
-      <w:r>
-        <w:rPr>
-          <w:rFonts w:eastAsia="Arial"/>
+          <w:rFonts w:ascii="Arial" w:eastAsia="Arial" w:hAnsi="Arial" w:cs="Arial"/>
+        </w:rPr>
+      </w:pPr>
+      <w:r>
+        <w:rPr>
+          <w:rFonts w:ascii="Arial" w:eastAsia="Arial" w:hAnsi="Arial" w:cs="Arial"/>
         </w:rPr>
         <w:t>Recommended Monitoring Frequency</w:t>
       </w:r>
@@ -24846,18 +24882,24 @@
         <w:pStyle w:val="Heading3"/>
         <w:jc w:val="center"/>
         <w:rPr>
-          <w:rFonts w:eastAsia="Arial"/>
-        </w:rPr>
-      </w:pPr>
-      <w:r>
-        <w:rPr>
-          <w:rFonts w:eastAsia="Arial"/>
+          <w:rFonts w:ascii="Arial" w:eastAsia="Arial" w:hAnsi="Arial" w:cs="Arial"/>
+        </w:rPr>
+      </w:pPr>
+      <w:r>
+        <w:rPr>
+          <w:rFonts w:ascii="Arial" w:eastAsia="Arial" w:hAnsi="Arial" w:cs="Arial"/>
         </w:rPr>
         <w:lastRenderedPageBreak/>
         <w:t>Extension of Software Tools for IPv6</w:t>
       </w:r>
     </w:p>
-    <w:p/>
+    <w:p>
+      <w:pPr>
+        <w:rPr>
+          <w:rFonts w:ascii="Arial" w:hAnsi="Arial" w:cs="Arial"/>
+        </w:rPr>
+      </w:pPr>
+    </w:p>
     <w:tbl>
       <w:tblPr>
         <w:tblStyle w:val="GridTable5Dark-Accent1"/>
@@ -25894,11 +25936,17 @@
         </w:tc>
       </w:tr>
     </w:tbl>
-    <w:p/>
-    <w:p>
-      <w:pPr>
-        <w:rPr>
-          <w:rFonts w:eastAsia="Arial"/>
+    <w:p>
+      <w:pPr>
+        <w:rPr>
+          <w:rFonts w:ascii="Arial" w:hAnsi="Arial" w:cs="Arial"/>
+        </w:rPr>
+      </w:pPr>
+    </w:p>
+    <w:p>
+      <w:pPr>
+        <w:rPr>
+          <w:rFonts w:ascii="Arial" w:eastAsia="Arial" w:hAnsi="Arial" w:cs="Arial"/>
         </w:rPr>
       </w:pPr>
     </w:p>
@@ -25950,12 +25998,12 @@
       <w:pPr>
         <w:pStyle w:val="Heading2"/>
         <w:rPr>
-          <w:rFonts w:eastAsia="Arial"/>
-        </w:rPr>
-      </w:pPr>
-      <w:r>
-        <w:rPr>
-          <w:rFonts w:eastAsia="Arial"/>
+          <w:rFonts w:ascii="Arial" w:eastAsia="Arial" w:hAnsi="Arial" w:cs="Arial"/>
+        </w:rPr>
+      </w:pPr>
+      <w:r>
+        <w:rPr>
+          <w:rFonts w:ascii="Arial" w:eastAsia="Arial" w:hAnsi="Arial" w:cs="Arial"/>
         </w:rPr>
         <w:lastRenderedPageBreak/>
         <w:t>Test Scenarios – IPv4/IPv6 Interoperability</w:t>
@@ -25964,7 +26012,7 @@
     <w:p>
       <w:pPr>
         <w:rPr>
-          <w:rFonts w:eastAsia="Arial"/>
+          <w:rFonts w:ascii="Arial" w:eastAsia="Arial" w:hAnsi="Arial" w:cs="Arial"/>
         </w:rPr>
       </w:pPr>
     </w:p>
@@ -25973,12 +26021,12 @@
         <w:pStyle w:val="Heading3"/>
         <w:jc w:val="center"/>
         <w:rPr>
-          <w:rFonts w:eastAsia="Arial"/>
-        </w:rPr>
-      </w:pPr>
-      <w:r>
-        <w:rPr>
-          <w:rFonts w:eastAsia="Arial"/>
+          <w:rFonts w:ascii="Arial" w:eastAsia="Arial" w:hAnsi="Arial" w:cs="Arial"/>
+        </w:rPr>
+      </w:pPr>
+      <w:r>
+        <w:rPr>
+          <w:rFonts w:ascii="Arial" w:eastAsia="Arial" w:hAnsi="Arial" w:cs="Arial"/>
         </w:rPr>
         <w:t>Dual-Stack Connectivity Test</w:t>
       </w:r>
@@ -26177,12 +26225,12 @@
         <w:pStyle w:val="Heading3"/>
         <w:jc w:val="center"/>
         <w:rPr>
-          <w:rFonts w:eastAsia="Arial"/>
-        </w:rPr>
-      </w:pPr>
-      <w:r>
-        <w:rPr>
-          <w:rFonts w:eastAsia="Arial"/>
+          <w:rFonts w:ascii="Arial" w:eastAsia="Arial" w:hAnsi="Arial" w:cs="Arial"/>
+        </w:rPr>
+      </w:pPr>
+      <w:r>
+        <w:rPr>
+          <w:rFonts w:ascii="Arial" w:eastAsia="Arial" w:hAnsi="Arial" w:cs="Arial"/>
         </w:rPr>
         <w:t>IPv6 ACL Application Test on Firewall2</w:t>
       </w:r>
@@ -26330,12 +26378,12 @@
         <w:pStyle w:val="Heading3"/>
         <w:jc w:val="center"/>
         <w:rPr>
-          <w:rFonts w:eastAsia="Arial"/>
-        </w:rPr>
-      </w:pPr>
-      <w:r>
-        <w:rPr>
-          <w:rFonts w:eastAsia="Arial"/>
+          <w:rFonts w:ascii="Arial" w:eastAsia="Arial" w:hAnsi="Arial" w:cs="Arial"/>
+        </w:rPr>
+      </w:pPr>
+      <w:r>
+        <w:rPr>
+          <w:rFonts w:ascii="Arial" w:eastAsia="Arial" w:hAnsi="Arial" w:cs="Arial"/>
         </w:rPr>
         <w:t>DNS Parity Test (A and AAAA Records)</w:t>
       </w:r>
@@ -26562,8 +26610,14 @@
       <w:pPr>
         <w:pStyle w:val="Heading3"/>
         <w:jc w:val="center"/>
-      </w:pPr>
-      <w:r>
+        <w:rPr>
+          <w:rFonts w:ascii="Arial" w:hAnsi="Arial" w:cs="Arial"/>
+        </w:rPr>
+      </w:pPr>
+      <w:r>
+        <w:rPr>
+          <w:rFonts w:ascii="Arial" w:hAnsi="Arial" w:cs="Arial"/>
+        </w:rPr>
         <w:t>Happy Eyeballs Test (Client Protocol Selection)</w:t>
       </w:r>
     </w:p>
@@ -26743,12 +26797,12 @@
       <w:pPr>
         <w:pStyle w:val="Heading2"/>
         <w:rPr>
-          <w:rFonts w:eastAsia="Arial"/>
-        </w:rPr>
-      </w:pPr>
-      <w:r>
-        <w:rPr>
-          <w:rFonts w:eastAsia="Arial"/>
+          <w:rFonts w:ascii="Arial" w:eastAsia="Arial" w:hAnsi="Arial" w:cs="Arial"/>
+        </w:rPr>
+      </w:pPr>
+      <w:r>
+        <w:rPr>
+          <w:rFonts w:ascii="Arial" w:eastAsia="Arial" w:hAnsi="Arial" w:cs="Arial"/>
         </w:rPr>
         <w:t>RA Guard and DHCPv6 Guard Test</w:t>
       </w:r>
@@ -28013,12 +28067,12 @@
       <w:pPr>
         <w:pStyle w:val="Heading2"/>
         <w:rPr>
-          <w:rFonts w:eastAsia="Arial"/>
-        </w:rPr>
-      </w:pPr>
-      <w:r>
-        <w:rPr>
-          <w:rFonts w:eastAsia="Arial"/>
+          <w:rFonts w:ascii="Arial" w:eastAsia="Arial" w:hAnsi="Arial" w:cs="Arial"/>
+        </w:rPr>
+      </w:pPr>
+      <w:r>
+        <w:rPr>
+          <w:rFonts w:ascii="Arial" w:eastAsia="Arial" w:hAnsi="Arial" w:cs="Arial"/>
         </w:rPr>
         <w:lastRenderedPageBreak/>
         <w:t>Standard Operating Procedures – Permanent Dual-Stack</w:t>
@@ -28049,12 +28103,12 @@
         <w:pStyle w:val="Heading3"/>
         <w:jc w:val="center"/>
         <w:rPr>
-          <w:rFonts w:eastAsia="Arial"/>
-        </w:rPr>
-      </w:pPr>
-      <w:r>
-        <w:rPr>
-          <w:rFonts w:eastAsia="Arial"/>
+          <w:rFonts w:ascii="Arial" w:eastAsia="Arial" w:hAnsi="Arial" w:cs="Arial"/>
+        </w:rPr>
+      </w:pPr>
+      <w:r>
+        <w:rPr>
+          <w:rFonts w:ascii="Arial" w:eastAsia="Arial" w:hAnsi="Arial" w:cs="Arial"/>
         </w:rPr>
         <w:t>Adding a New VLAN in Dual-Stack</w:t>
       </w:r>
@@ -28298,14 +28352,26 @@
       <w:pPr>
         <w:pStyle w:val="Heading3"/>
         <w:jc w:val="center"/>
-      </w:pPr>
-      <w:r>
+        <w:rPr>
+          <w:rFonts w:ascii="Arial" w:hAnsi="Arial" w:cs="Arial"/>
+        </w:rPr>
+      </w:pPr>
+      <w:r>
+        <w:rPr>
+          <w:rFonts w:ascii="Arial" w:hAnsi="Arial" w:cs="Arial"/>
+        </w:rPr>
         <w:t xml:space="preserve">Maintenance </w:t>
       </w:r>
       <w:r>
+        <w:rPr>
+          <w:rFonts w:ascii="Arial" w:hAnsi="Arial" w:cs="Arial"/>
+        </w:rPr>
         <w:t xml:space="preserve">and </w:t>
       </w:r>
       <w:r>
+        <w:rPr>
+          <w:rFonts w:ascii="Arial" w:hAnsi="Arial" w:cs="Arial"/>
+        </w:rPr>
         <w:t>Dual-Stack Evaluation</w:t>
       </w:r>
     </w:p>
@@ -28478,12 +28544,12 @@
         <w:pStyle w:val="Heading3"/>
         <w:jc w:val="center"/>
         <w:rPr>
-          <w:rFonts w:eastAsia="Arial"/>
-        </w:rPr>
-      </w:pPr>
-      <w:r>
-        <w:rPr>
-          <w:rFonts w:eastAsia="Arial"/>
+          <w:rFonts w:ascii="Arial" w:eastAsia="Arial" w:hAnsi="Arial" w:cs="Arial"/>
+        </w:rPr>
+      </w:pPr>
+      <w:r>
+        <w:rPr>
+          <w:rFonts w:ascii="Arial" w:eastAsia="Arial" w:hAnsi="Arial" w:cs="Arial"/>
         </w:rPr>
         <w:t>Incident Response: Partial IPv6 Failure (IPv4 Operational)</w:t>
       </w:r>
@@ -43772,6 +43838,7 @@
   <w:style w:type="character" w:default="1" w:styleId="DefaultParagraphFont">
     <w:name w:val="Default Paragraph Font"/>
     <w:uiPriority w:val="1"/>
+    <w:semiHidden/>
     <w:unhideWhenUsed/>
   </w:style>
   <w:style w:type="table" w:default="1" w:styleId="TableNormal">
@@ -44987,28 +45054,28 @@
 </file>
 
 <file path=customXml/item1.xml><?xml version="1.0" encoding="utf-8"?>
+<b:Sources xmlns:b="http://schemas.openxmlformats.org/officeDocument/2006/bibliography" xmlns="http://schemas.openxmlformats.org/officeDocument/2006/bibliography" SelectedStyle="/APASixthEditionOfficeOnline.xsl" StyleName="APA" Version="6"/>
+</file>
+
+<file path=customXml/item2.xml><?xml version="1.0" encoding="utf-8"?>
 <go:gDocsCustomXmlDataStorage xmlns:go="http://customooxmlschemas.google.com/" xmlns:r="http://schemas.openxmlformats.org/officeDocument/2006/relationships" uri="GoogleDocsCustomDataVersion2">
   <go:docsCustomData xmlns:go="http://customooxmlschemas.google.com/" roundtripDataSignature="AMtx7mhXDe5v3cvSperzj1G0ooYz/KfWPQ==">CgMxLjA4AHIhMWFqTnJ5dk9fSkdEaWY4bmgzb2dnMUpHNUNSeGJWdkZC</go:docsCustomData>
 </go:gDocsCustomXmlDataStorage>
 </file>
 
-<file path=customXml/item2.xml><?xml version="1.0" encoding="utf-8"?>
-<b:Sources xmlns:b="http://schemas.openxmlformats.org/officeDocument/2006/bibliography" xmlns="http://schemas.openxmlformats.org/officeDocument/2006/bibliography" SelectedStyle="/APASixthEditionOfficeOnline.xsl" StyleName="APA" Version="6"/>
+<file path=customXml/itemProps1.xml><?xml version="1.0" encoding="utf-8"?>
+<ds:datastoreItem xmlns:ds="http://schemas.openxmlformats.org/officeDocument/2006/customXml" ds:itemID="{CFDD7CA5-0948-F142-8404-06CDD2C38A51}">
+  <ds:schemaRefs>
+    <ds:schemaRef ds:uri="http://schemas.openxmlformats.org/officeDocument/2006/bibliography"/>
+  </ds:schemaRefs>
+</ds:datastoreItem>
 </file>
 
-<file path=customXml/itemProps1.xml><?xml version="1.0" encoding="utf-8"?>
+<file path=customXml/itemProps2.xml><?xml version="1.0" encoding="utf-8"?>
 <ds:datastoreItem xmlns:ds="http://schemas.openxmlformats.org/officeDocument/2006/customXml" ds:itemID="{11111111-1234-1234-1234-123412341234}">
   <ds:schemaRefs>
     <ds:schemaRef ds:uri="http://customooxmlschemas.google.com/"/>
     <ds:schemaRef ds:uri="http://schemas.openxmlformats.org/officeDocument/2006/relationships"/>
   </ds:schemaRefs>
 </ds:datastoreItem>
-</file>
-
-<file path=customXml/itemProps2.xml><?xml version="1.0" encoding="utf-8"?>
-<ds:datastoreItem xmlns:ds="http://schemas.openxmlformats.org/officeDocument/2006/customXml" ds:itemID="{CFDD7CA5-0948-F142-8404-06CDD2C38A51}">
-  <ds:schemaRefs>
-    <ds:schemaRef ds:uri="http://schemas.openxmlformats.org/officeDocument/2006/bibliography"/>
-  </ds:schemaRefs>
-</ds:datastoreItem>
 </file>
</xml_diff>